<commit_message>
analyse le nombre de révolution - p2
</commit_message>
<xml_diff>
--- a/analyse-revolution/revolution.docx
+++ b/analyse-revolution/revolution.docx
@@ -26,7 +26,7 @@
         <w:t xml:space="preserve">2025-05-28</w:t>
       </w:r>
     </w:p>
-    <w:bookmarkStart w:id="24" w:name="etude-statistique-univariée-quantitative"/>
+    <w:bookmarkStart w:id="33" w:name="etude-statistique-univariée-quantitative"/>
     <w:p>
       <w:pPr>
         <w:pStyle w:val="Heading1"/>
@@ -35,7 +35,7 @@
         <w:t xml:space="preserve">Etude statistique univariée quantitative</w:t>
       </w:r>
     </w:p>
-    <w:bookmarkStart w:id="23" w:name="présentation-des-données"/>
+    <w:bookmarkStart w:id="32" w:name="présentation-des-données"/>
     <w:p>
       <w:pPr>
         <w:pStyle w:val="Heading2"/>
@@ -563,13 +563,21 @@
       </w:tr>
     </w:tbl>
     <w:bookmarkEnd w:id="20"/>
-    <w:bookmarkStart w:id="21" w:name="X09795793d56f1e00ca3a13bd987bbec951a9ac2"/>
+    <w:bookmarkStart w:id="21" w:name="X884bfc5f9fa817eba8a93dc315a36711b3463cf"/>
     <w:p>
       <w:pPr>
         <w:pStyle w:val="Heading3"/>
       </w:pPr>
       <w:r>
-        <w:t xml:space="preserve">Données groupées par le nombre de révolution</w:t>
+        <w:t xml:space="preserve">Données groupées par les 10 intervalles du nombre de révolutions</w:t>
+      </w:r>
+    </w:p>
+    <w:p>
+      <w:pPr>
+        <w:pStyle w:val="FirstParagraph"/>
+      </w:pPr>
+      <w:r>
+        <w:t xml:space="preserve">En effet, en raison du grand nombre de variations dans le nombre de révolutions, nous avons donc choisi de regrouper les données par intervalles, chaque intervalle couvrant une plage de 10 000 tours.</w:t>
       </w:r>
     </w:p>
     <w:tbl>
@@ -1056,6 +1064,240 @@
     <w:p>
       <w:pPr>
         <w:pStyle w:val="FirstParagraph"/>
+      </w:pPr>
+      <w:r>
+        <w:t xml:space="preserve">Un tableau récapitulatif des caractéristiques numériques</w:t>
+      </w:r>
+    </w:p>
+    <w:p>
+      <w:pPr>
+        <w:pStyle w:val="TableCaption"/>
+      </w:pPr>
+      <w:r>
+        <w:t xml:space="preserve">Résumé statistique</w:t>
+      </w:r>
+    </w:p>
+    <w:tbl>
+      <w:tblPr>
+        <w:tblStyle w:val="Table"/>
+        <w:tblW w:type="pct" w:w="5000"/>
+        <w:tblLayout w:type="fixed"/>
+        <w:tblLook w:firstRow="1" w:lastRow="0" w:firstColumn="0" w:lastColumn="0" w:noHBand="0" w:noVBand="0" w:val="0020"/>
+        <w:tblCaption w:val="Résumé statistique"/>
+      </w:tblPr>
+      <w:tblGrid>
+        <w:gridCol w:w="990"/>
+        <w:gridCol w:w="618"/>
+        <w:gridCol w:w="990"/>
+        <w:gridCol w:w="990"/>
+        <w:gridCol w:w="990"/>
+        <w:gridCol w:w="990"/>
+        <w:gridCol w:w="990"/>
+        <w:gridCol w:w="1361"/>
+      </w:tblGrid>
+      <w:tr>
+        <w:trPr>
+          <w:tblHeader w:val="on"/>
+        </w:trPr>
+        <w:tc>
+          <w:tcPr/>
+          <w:p>
+            <w:pPr>
+              <w:pStyle w:val="Compact"/>
+              <w:jc w:val="right"/>
+            </w:pPr>
+            <w:r>
+              <w:t xml:space="preserve">Minimum</w:t>
+            </w:r>
+          </w:p>
+        </w:tc>
+        <w:tc>
+          <w:tcPr/>
+          <w:p>
+            <w:pPr>
+              <w:pStyle w:val="Compact"/>
+              <w:jc w:val="right"/>
+            </w:pPr>
+            <w:r>
+              <w:t xml:space="preserve">Q1</w:t>
+            </w:r>
+          </w:p>
+        </w:tc>
+        <w:tc>
+          <w:tcPr/>
+          <w:p>
+            <w:pPr>
+              <w:pStyle w:val="Compact"/>
+              <w:jc w:val="right"/>
+            </w:pPr>
+            <w:r>
+              <w:t xml:space="preserve">Mediane</w:t>
+            </w:r>
+          </w:p>
+        </w:tc>
+        <w:tc>
+          <w:tcPr/>
+          <w:p>
+            <w:pPr>
+              <w:pStyle w:val="Compact"/>
+              <w:jc w:val="right"/>
+            </w:pPr>
+            <w:r>
+              <w:t xml:space="preserve">Moyenne</w:t>
+            </w:r>
+          </w:p>
+        </w:tc>
+        <w:tc>
+          <w:tcPr/>
+          <w:p>
+            <w:pPr>
+              <w:pStyle w:val="Compact"/>
+              <w:jc w:val="right"/>
+            </w:pPr>
+            <w:r>
+              <w:t xml:space="preserve">Q3</w:t>
+            </w:r>
+          </w:p>
+        </w:tc>
+        <w:tc>
+          <w:tcPr/>
+          <w:p>
+            <w:pPr>
+              <w:pStyle w:val="Compact"/>
+              <w:jc w:val="right"/>
+            </w:pPr>
+            <w:r>
+              <w:t xml:space="preserve">Maximum</w:t>
+            </w:r>
+          </w:p>
+        </w:tc>
+        <w:tc>
+          <w:tcPr/>
+          <w:p>
+            <w:pPr>
+              <w:pStyle w:val="Compact"/>
+              <w:jc w:val="right"/>
+            </w:pPr>
+            <w:r>
+              <w:t xml:space="preserve">Etendue</w:t>
+            </w:r>
+          </w:p>
+        </w:tc>
+        <w:tc>
+          <w:tcPr/>
+          <w:p>
+            <w:pPr>
+              <w:pStyle w:val="Compact"/>
+              <w:jc w:val="right"/>
+            </w:pPr>
+            <w:r>
+              <w:t xml:space="preserve">Ecart_type</w:t>
+            </w:r>
+          </w:p>
+        </w:tc>
+      </w:tr>
+      <w:tr>
+        <w:tc>
+          <w:tcPr/>
+          <w:p>
+            <w:pPr>
+              <w:pStyle w:val="Compact"/>
+              <w:jc w:val="right"/>
+            </w:pPr>
+            <w:r>
+              <w:t xml:space="preserve">1</w:t>
+            </w:r>
+          </w:p>
+        </w:tc>
+        <w:tc>
+          <w:tcPr/>
+          <w:p>
+            <w:pPr>
+              <w:pStyle w:val="Compact"/>
+              <w:jc w:val="right"/>
+            </w:pPr>
+            <w:r>
+              <w:t xml:space="preserve">5349</w:t>
+            </w:r>
+          </w:p>
+        </w:tc>
+        <w:tc>
+          <w:tcPr/>
+          <w:p>
+            <w:pPr>
+              <w:pStyle w:val="Compact"/>
+              <w:jc w:val="right"/>
+            </w:pPr>
+            <w:r>
+              <w:t xml:space="preserve">11443</w:t>
+            </w:r>
+          </w:p>
+        </w:tc>
+        <w:tc>
+          <w:tcPr/>
+          <w:p>
+            <w:pPr>
+              <w:pStyle w:val="Compact"/>
+              <w:jc w:val="right"/>
+            </w:pPr>
+            <w:r>
+              <w:t xml:space="preserve">17359.8</w:t>
+            </w:r>
+          </w:p>
+        </w:tc>
+        <w:tc>
+          <w:tcPr/>
+          <w:p>
+            <w:pPr>
+              <w:pStyle w:val="Compact"/>
+              <w:jc w:val="right"/>
+            </w:pPr>
+            <w:r>
+              <w:t xml:space="preserve">20143.5</w:t>
+            </w:r>
+          </w:p>
+        </w:tc>
+        <w:tc>
+          <w:tcPr/>
+          <w:p>
+            <w:pPr>
+              <w:pStyle w:val="Compact"/>
+              <w:jc w:val="right"/>
+            </w:pPr>
+            <w:r>
+              <w:t xml:space="preserve">99981</w:t>
+            </w:r>
+          </w:p>
+        </w:tc>
+        <w:tc>
+          <w:tcPr/>
+          <w:p>
+            <w:pPr>
+              <w:pStyle w:val="Compact"/>
+              <w:jc w:val="right"/>
+            </w:pPr>
+            <w:r>
+              <w:t xml:space="preserve">99980</w:t>
+            </w:r>
+          </w:p>
+        </w:tc>
+        <w:tc>
+          <w:tcPr/>
+          <w:p>
+            <w:pPr>
+              <w:pStyle w:val="Compact"/>
+              <w:jc w:val="right"/>
+            </w:pPr>
+            <w:r>
+              <w:t xml:space="preserve">19280.69</w:t>
+            </w:r>
+          </w:p>
+        </w:tc>
+      </w:tr>
+    </w:tbl>
+    <w:p>
+      <w:pPr>
+        <w:pStyle w:val="BodyText"/>
       </w:pPr>
       <w:r>
         <w:t xml:space="preserve">Vous trouverez ci-dessous un tableau récapitulatif des caractéristiques numériques pour les 10 intervalles du nombre de révolution.</w:t>
@@ -2161,8 +2403,138 @@
       </w:tr>
     </w:tbl>
     <w:bookmarkEnd w:id="22"/>
-    <w:bookmarkEnd w:id="23"/>
-    <w:bookmarkEnd w:id="24"/>
+    <w:bookmarkStart w:id="31" w:name="visualisation"/>
+    <w:p>
+      <w:pPr>
+        <w:pStyle w:val="Heading3"/>
+      </w:pPr>
+      <w:r>
+        <w:t xml:space="preserve">Visualisation</w:t>
+      </w:r>
+    </w:p>
+    <w:bookmarkStart w:id="26" w:name="histogramme"/>
+    <w:p>
+      <w:pPr>
+        <w:pStyle w:val="Heading4"/>
+      </w:pPr>
+      <w:r>
+        <w:t xml:space="preserve">Histogramme</w:t>
+      </w:r>
+    </w:p>
+    <w:p>
+      <w:pPr>
+        <w:pStyle w:val="FirstParagraph"/>
+      </w:pPr>
+      <w:r>
+        <w:t xml:space="preserve">L’histogramme ci-dessous représente la distribution (en pourcentage) des satellites en fonction des 10 intervalles du nombre de révolutions.</w:t>
+      </w:r>
+      <w:r>
+        <w:t xml:space="preserve"> </w:t>
+      </w:r>
+      <w:r>
+        <w:drawing>
+          <wp:inline>
+            <wp:extent cx="5334000" cy="4267200"/>
+            <wp:effectExtent b="0" l="0" r="0" t="0"/>
+            <wp:docPr descr="" title="" id="24" name="Picture"/>
+            <a:graphic>
+              <a:graphicData uri="http://schemas.openxmlformats.org/drawingml/2006/picture">
+                <pic:pic>
+                  <pic:nvPicPr>
+                    <pic:cNvPr descr="revolution_files/figure-docx/unnamed-chunk-6-1.png" id="25" name="Picture"/>
+                    <pic:cNvPicPr>
+                      <a:picLocks noChangeArrowheads="1" noChangeAspect="1"/>
+                    </pic:cNvPicPr>
+                  </pic:nvPicPr>
+                  <pic:blipFill>
+                    <a:blip r:embed="rId23"/>
+                    <a:stretch>
+                      <a:fillRect/>
+                    </a:stretch>
+                  </pic:blipFill>
+                  <pic:spPr bwMode="auto">
+                    <a:xfrm>
+                      <a:off x="0" y="0"/>
+                      <a:ext cx="5334000" cy="4267200"/>
+                    </a:xfrm>
+                    <a:prstGeom prst="rect">
+                      <a:avLst/>
+                    </a:prstGeom>
+                    <a:noFill/>
+                    <a:ln w="9525">
+                      <a:noFill/>
+                      <a:headEnd/>
+                      <a:tailEnd/>
+                    </a:ln>
+                  </pic:spPr>
+                </pic:pic>
+              </a:graphicData>
+            </a:graphic>
+          </wp:inline>
+        </w:drawing>
+      </w:r>
+    </w:p>
+    <w:bookmarkEnd w:id="26"/>
+    <w:bookmarkStart w:id="30" w:name="boîte-à-moustaches-globale"/>
+    <w:p>
+      <w:pPr>
+        <w:pStyle w:val="Heading4"/>
+      </w:pPr>
+      <w:r>
+        <w:t xml:space="preserve">Boîte à moustaches globale</w:t>
+      </w:r>
+    </w:p>
+    <w:p>
+      <w:pPr>
+        <w:pStyle w:val="FirstParagraph"/>
+      </w:pPr>
+      <w:r>
+        <w:drawing>
+          <wp:inline>
+            <wp:extent cx="5334000" cy="4267200"/>
+            <wp:effectExtent b="0" l="0" r="0" t="0"/>
+            <wp:docPr descr="" title="" id="28" name="Picture"/>
+            <a:graphic>
+              <a:graphicData uri="http://schemas.openxmlformats.org/drawingml/2006/picture">
+                <pic:pic>
+                  <pic:nvPicPr>
+                    <pic:cNvPr descr="revolution_files/figure-docx/unnamed-chunk-7-1.png" id="29" name="Picture"/>
+                    <pic:cNvPicPr>
+                      <a:picLocks noChangeArrowheads="1" noChangeAspect="1"/>
+                    </pic:cNvPicPr>
+                  </pic:nvPicPr>
+                  <pic:blipFill>
+                    <a:blip r:embed="rId27"/>
+                    <a:stretch>
+                      <a:fillRect/>
+                    </a:stretch>
+                  </pic:blipFill>
+                  <pic:spPr bwMode="auto">
+                    <a:xfrm>
+                      <a:off x="0" y="0"/>
+                      <a:ext cx="5334000" cy="4267200"/>
+                    </a:xfrm>
+                    <a:prstGeom prst="rect">
+                      <a:avLst/>
+                    </a:prstGeom>
+                    <a:noFill/>
+                    <a:ln w="9525">
+                      <a:noFill/>
+                      <a:headEnd/>
+                      <a:tailEnd/>
+                    </a:ln>
+                  </pic:spPr>
+                </pic:pic>
+              </a:graphicData>
+            </a:graphic>
+          </wp:inline>
+        </w:drawing>
+      </w:r>
+    </w:p>
+    <w:bookmarkEnd w:id="30"/>
+    <w:bookmarkEnd w:id="31"/>
+    <w:bookmarkEnd w:id="32"/>
+    <w:bookmarkEnd w:id="33"/>
     <w:sectPr/>
   </w:body>
 </w:document>

</xml_diff>